<commit_message>
Update UHC Finance Demo files with corrected permissions
Co-authored-by: Copilot <223556219+Copilot@users.noreply.github.com>
</commit_message>
<xml_diff>
--- a/UHC_AgentSCALE_Finance_Demo_Prompts.docx
+++ b/UHC_AgentSCALE_Finance_Demo_Prompts.docx
@@ -165,12 +165,6 @@
         <w:gridCol w:w="9360"/>
       </w:tblGrid>
       <w:tr>
-        <w:tblPrEx>
-          <w:tblCellMar>
-            <w:top w:w="0" w:type="dxa"/>
-            <w:bottom w:w="0" w:type="dxa"/>
-          </w:tblCellMar>
-        </w:tblPrEx>
         <w:tc>
           <w:tcPr>
             <w:tcW w:w="9360" w:type="dxa"/>
@@ -281,12 +275,6 @@
         <w:gridCol w:w="9360"/>
       </w:tblGrid>
       <w:tr>
-        <w:tblPrEx>
-          <w:tblCellMar>
-            <w:top w:w="0" w:type="dxa"/>
-            <w:bottom w:w="0" w:type="dxa"/>
-          </w:tblCellMar>
-        </w:tblPrEx>
         <w:tc>
           <w:tcPr>
             <w:tcW w:w="9360" w:type="dxa"/>
@@ -398,12 +386,6 @@
         <w:gridCol w:w="9360"/>
       </w:tblGrid>
       <w:tr>
-        <w:tblPrEx>
-          <w:tblCellMar>
-            <w:top w:w="0" w:type="dxa"/>
-            <w:bottom w:w="0" w:type="dxa"/>
-          </w:tblCellMar>
-        </w:tblPrEx>
         <w:tc>
           <w:tcPr>
             <w:tcW w:w="9360" w:type="dxa"/>
@@ -468,12 +450,6 @@
         <w:gridCol w:w="9360"/>
       </w:tblGrid>
       <w:tr>
-        <w:tblPrEx>
-          <w:tblCellMar>
-            <w:top w:w="0" w:type="dxa"/>
-            <w:bottom w:w="0" w:type="dxa"/>
-          </w:tblCellMar>
-        </w:tblPrEx>
         <w:tc>
           <w:tcPr>
             <w:tcW w:w="9360" w:type="dxa"/>
@@ -588,12 +564,6 @@
         <w:gridCol w:w="9360"/>
       </w:tblGrid>
       <w:tr>
-        <w:tblPrEx>
-          <w:tblCellMar>
-            <w:top w:w="0" w:type="dxa"/>
-            <w:bottom w:w="0" w:type="dxa"/>
-          </w:tblCellMar>
-        </w:tblPrEx>
         <w:tc>
           <w:tcPr>
             <w:tcW w:w="9360" w:type="dxa"/>
@@ -638,6 +608,7 @@
           <w:sz w:val="20"/>
           <w:szCs w:val="20"/>
         </w:rPr>
+        <w:lastRenderedPageBreak/>
         <w:t xml:space="preserve">Demo tip: </w:t>
       </w:r>
       <w:r>
@@ -692,12 +663,6 @@
         <w:gridCol w:w="9360"/>
       </w:tblGrid>
       <w:tr>
-        <w:tblPrEx>
-          <w:tblCellMar>
-            <w:top w:w="0" w:type="dxa"/>
-            <w:bottom w:w="0" w:type="dxa"/>
-          </w:tblCellMar>
-        </w:tblPrEx>
         <w:tc>
           <w:tcPr>
             <w:tcW w:w="9360" w:type="dxa"/>
@@ -796,12 +761,6 @@
         <w:gridCol w:w="9360"/>
       </w:tblGrid>
       <w:tr>
-        <w:tblPrEx>
-          <w:tblCellMar>
-            <w:top w:w="0" w:type="dxa"/>
-            <w:bottom w:w="0" w:type="dxa"/>
-          </w:tblCellMar>
-        </w:tblPrEx>
         <w:tc>
           <w:tcPr>
             <w:tcW w:w="9360" w:type="dxa"/>
@@ -910,12 +869,6 @@
         <w:gridCol w:w="9360"/>
       </w:tblGrid>
       <w:tr>
-        <w:tblPrEx>
-          <w:tblCellMar>
-            <w:top w:w="0" w:type="dxa"/>
-            <w:bottom w:w="0" w:type="dxa"/>
-          </w:tblCellMar>
-        </w:tblPrEx>
         <w:tc>
           <w:tcPr>
             <w:tcW w:w="9360" w:type="dxa"/>
@@ -1220,6 +1173,149 @@
     </w:p>
     <w:p>
       <w:pPr>
+        <w:pStyle w:val="Heading1"/>
+        <w:rPr>
+          <w:kern w:val="36"/>
+          <w14:ligatures w14:val="standardContextual"/>
+        </w:rPr>
+      </w:pPr>
+      <w:r>
+        <w:t>4. Final Prompt — Create an Infographic</w:t>
+      </w:r>
+    </w:p>
+    <w:p>
+      <w:pPr>
+        <w:spacing w:after="120"/>
+        <w:rPr>
+          <w:kern w:val="2"/>
+          <w14:ligatures w14:val="standardContextual"/>
+        </w:rPr>
+      </w:pPr>
+      <w:r>
+        <w:t>Close the demo by turning the finance story into a visual executive summary. Run this after the Excel analysis, Word brief, or PowerPoint deck has already been generated in the same chat.</w:t>
+      </w:r>
+    </w:p>
+    <w:p>
+      <w:pPr>
+        <w:spacing w:before="80" w:after="60"/>
+        <w:rPr>
+          <w:kern w:val="2"/>
+          <w14:ligatures w14:val="standardContextual"/>
+        </w:rPr>
+      </w:pPr>
+      <w:r>
+        <w:rPr>
+          <w:b/>
+          <w:bCs/>
+          <w:color w:val="002677"/>
+        </w:rPr>
+        <w:t>PROMPT — Infographic</w:t>
+      </w:r>
+    </w:p>
+    <w:tbl>
+      <w:tblPr>
+        <w:tblW w:w="9360" w:type="dxa"/>
+        <w:tblCellMar>
+          <w:left w:w="0" w:type="dxa"/>
+          <w:right w:w="0" w:type="dxa"/>
+        </w:tblCellMar>
+        <w:tblLook w:val="04A0" w:firstRow="1" w:lastRow="0" w:firstColumn="1" w:lastColumn="0" w:noHBand="0" w:noVBand="1"/>
+      </w:tblPr>
+      <w:tblGrid>
+        <w:gridCol w:w="9360"/>
+      </w:tblGrid>
+      <w:tr>
+        <w:tc>
+          <w:tcPr>
+            <w:tcW w:w="9360" w:type="dxa"/>
+            <w:tcBorders>
+              <w:top w:val="single" w:sz="8" w:space="0" w:color="2E75B6"/>
+              <w:left w:val="single" w:sz="12" w:space="0" w:color="002677"/>
+              <w:bottom w:val="single" w:sz="8" w:space="0" w:color="2E75B6"/>
+              <w:right w:val="single" w:sz="8" w:space="0" w:color="2E75B6"/>
+            </w:tcBorders>
+            <w:shd w:val="clear" w:color="auto" w:fill="EAF1FB"/>
+            <w:tcMar>
+              <w:top w:w="140" w:type="dxa"/>
+              <w:left w:w="180" w:type="dxa"/>
+              <w:bottom w:w="140" w:type="dxa"/>
+              <w:right w:w="180" w:type="dxa"/>
+            </w:tcMar>
+            <w:hideMark/>
+          </w:tcPr>
+          <w:p>
+            <w:pPr>
+              <w:rPr>
+                <w:kern w:val="2"/>
+                <w14:ligatures w14:val="standardContextual"/>
+              </w:rPr>
+            </w:pPr>
+            <w:r>
+              <w:rPr>
+                <w:rFonts w:ascii="Consolas" w:hAnsi="Consolas"/>
+                <w:color w:val="000000"/>
+                <w:sz w:val="20"/>
+                <w:szCs w:val="20"/>
+              </w:rPr>
+              <w:lastRenderedPageBreak/>
+              <w:t xml:space="preserve">Using the finance brief, slide outline, and analysis above, create a one-page executive infographic for UnitedHealthcare Finance Operations. The infographic should visually summarize: (1) Jan–May financial performance, including premium revenue, claims paid, net income, and MLR trend; (2) claims and payment health, including overdue payments, aged pending claims, and dollars at risk; (3) the top operational risks from denials, payment holds, and past-due deadlines; and (4) the three recommended actions for leadership. Use a clean corporate healthcare-finance style with concise labels, large headline numbers, simple icons, and a left-to-right flow from Performance → Risk → Action. Include only numbers supported by UHC_Finance_Demo_Detailed.xlsx or the brief </w:t>
+            </w:r>
+            <w:proofErr w:type="gramStart"/>
+            <w:r>
+              <w:rPr>
+                <w:rFonts w:ascii="Consolas" w:hAnsi="Consolas"/>
+                <w:color w:val="000000"/>
+                <w:sz w:val="20"/>
+                <w:szCs w:val="20"/>
+              </w:rPr>
+              <w:t>above, and</w:t>
+            </w:r>
+            <w:proofErr w:type="gramEnd"/>
+            <w:r>
+              <w:rPr>
+                <w:rFonts w:ascii="Consolas" w:hAnsi="Consolas"/>
+                <w:color w:val="000000"/>
+                <w:sz w:val="20"/>
+                <w:szCs w:val="20"/>
+              </w:rPr>
+              <w:t xml:space="preserve"> note the source file names in a small footer.</w:t>
+            </w:r>
+          </w:p>
+        </w:tc>
+      </w:tr>
+    </w:tbl>
+    <w:p>
+      <w:pPr>
+        <w:spacing w:before="80" w:after="220"/>
+        <w:rPr>
+          <w:kern w:val="2"/>
+          <w14:ligatures w14:val="standardContextual"/>
+        </w:rPr>
+      </w:pPr>
+      <w:r>
+        <w:rPr>
+          <w:b/>
+          <w:bCs/>
+          <w:i/>
+          <w:iCs/>
+          <w:color w:val="002677"/>
+          <w:sz w:val="20"/>
+          <w:szCs w:val="20"/>
+        </w:rPr>
+        <w:t xml:space="preserve">Demo tip: </w:t>
+      </w:r>
+      <w:r>
+        <w:rPr>
+          <w:i/>
+          <w:iCs/>
+          <w:sz w:val="20"/>
+          <w:szCs w:val="20"/>
+        </w:rPr>
+        <w:t>Position this as the final executive-ready artifact: the same chat thread can move from data analysis to written brief, slides, and a polished infographic. Call out that the prompt constrains the visual to supported numbers and asks for source labels, which reinforces responsible AI use in finance scenarios.</w:t>
+      </w:r>
+    </w:p>
+    <w:p>
+      <w:pPr>
         <w:spacing w:after="60"/>
       </w:pPr>
     </w:p>
@@ -1229,8 +1325,6 @@
           <w:top w:val="single" w:sz="6" w:space="2" w:color="2E75B6"/>
         </w:pBdr>
         <w:spacing w:before="160"/>
-      </w:pPr>
-      <w:r>
         <w:rPr>
           <w:i/>
           <w:iCs/>
@@ -1238,11 +1332,26 @@
           <w:sz w:val="18"/>
           <w:szCs w:val="18"/>
         </w:rPr>
+      </w:pPr>
+      <w:r>
+        <w:rPr>
+          <w:i/>
+          <w:iCs/>
+          <w:color w:val="666666"/>
+          <w:sz w:val="18"/>
+          <w:szCs w:val="18"/>
+        </w:rPr>
         <w:t>Prepared for the MS 4019 Agent SCALE delivery — United Healthcare (finance demos). All prompts reference UHC_Finance_Demo_Detailed.xlsx and UHC_Finance_Report_Demo.docx.</w:t>
       </w:r>
     </w:p>
+    <w:p/>
     <w:sectPr>
-      <w:footerReference w:type="default" r:id="rId7"/>
+      <w:headerReference w:type="even" r:id="rId7"/>
+      <w:headerReference w:type="default" r:id="rId8"/>
+      <w:footerReference w:type="even" r:id="rId9"/>
+      <w:footerReference w:type="default" r:id="rId10"/>
+      <w:headerReference w:type="first" r:id="rId11"/>
+      <w:footerReference w:type="first" r:id="rId12"/>
       <w:pgSz w:w="12240" w:h="15840"/>
       <w:pgMar w:top="1440" w:right="1440" w:bottom="1440" w:left="1440" w:header="708" w:footer="708" w:gutter="0"/>
       <w:cols w:space="720"/>
@@ -1272,6 +1381,16 @@
 </file>
 
 <file path=word/footer1.xml><?xml version="1.0" encoding="utf-8"?>
+<w:ftr xmlns:wpc="http://schemas.microsoft.com/office/word/2010/wordprocessingCanvas" xmlns:cx="http://schemas.microsoft.com/office/drawing/2014/chartex" xmlns:cx1="http://schemas.microsoft.com/office/drawing/2015/9/8/chartex" xmlns:cx2="http://schemas.microsoft.com/office/drawing/2015/10/21/chartex" xmlns:cx3="http://schemas.microsoft.com/office/drawing/2016/5/9/chartex" xmlns:cx4="http://schemas.microsoft.com/office/drawing/2016/5/10/chartex" xmlns:cx5="http://schemas.microsoft.com/office/drawing/2016/5/11/chartex" xmlns:cx6="http://schemas.microsoft.com/office/drawing/2016/5/12/chartex" xmlns:cx7="http://schemas.microsoft.com/office/drawing/2016/5/13/chartex" xmlns:cx8="http://schemas.microsoft.com/office/drawing/2016/5/14/chartex" xmlns:mc="http://schemas.openxmlformats.org/markup-compatibility/2006" xmlns:aink="http://schemas.microsoft.com/office/drawing/2016/ink" xmlns:am3d="http://schemas.microsoft.com/office/drawing/2017/model3d" xmlns:o="urn:schemas-microsoft-com:office:office" xmlns:oel="http://schemas.microsoft.com/office/2019/extlst" xmlns:r="http://schemas.openxmlformats.org/officeDocument/2006/relationships" xmlns:m="http://schemas.openxmlformats.org/officeDocument/2006/math" xmlns:v="urn:schemas-microsoft-com:vml" xmlns:wp14="http://schemas.microsoft.com/office/word/2010/wordprocessingDrawing" xmlns:wp="http://schemas.openxmlformats.org/drawingml/2006/wordprocessingDrawing" xmlns:w10="urn:schemas-microsoft-com:office:word" xmlns:w="http://schemas.openxmlformats.org/wordprocessingml/2006/main" xmlns:w14="http://schemas.microsoft.com/office/word/2010/wordml" xmlns:w15="http://schemas.microsoft.com/office/word/2012/wordml" xmlns:w16cex="http://schemas.microsoft.com/office/word/2018/wordml/cex" xmlns:w16cid="http://schemas.microsoft.com/office/word/2016/wordml/cid" xmlns:w16="http://schemas.microsoft.com/office/word/2018/wordml" xmlns:w16du="http://schemas.microsoft.com/office/word/2023/wordml/word16du" xmlns:w16sdtdh="http://schemas.microsoft.com/office/word/2020/wordml/sdtdatahash" xmlns:w16sdtfl="http://schemas.microsoft.com/office/word/2024/wordml/sdtformatlock" xmlns:w16se="http://schemas.microsoft.com/office/word/2015/wordml/symex" xmlns:wpg="http://schemas.microsoft.com/office/word/2010/wordprocessingGroup" xmlns:wpi="http://schemas.microsoft.com/office/word/2010/wordprocessingInk" xmlns:wne="http://schemas.microsoft.com/office/word/2006/wordml" xmlns:wps="http://schemas.microsoft.com/office/word/2010/wordprocessingShape" mc:Ignorable="w14 w15 w16se w16cid w16 w16cex w16sdtdh w16sdtfl w16du wp14">
+  <w:p>
+    <w:pPr>
+      <w:pStyle w:val="Footer"/>
+    </w:pPr>
+  </w:p>
+</w:ftr>
+</file>
+
+<file path=word/footer2.xml><?xml version="1.0" encoding="utf-8"?>
 <w:ftr xmlns:wpc="http://schemas.microsoft.com/office/word/2010/wordprocessingCanvas" xmlns:cx="http://schemas.microsoft.com/office/drawing/2014/chartex" xmlns:cx1="http://schemas.microsoft.com/office/drawing/2015/9/8/chartex" xmlns:cx2="http://schemas.microsoft.com/office/drawing/2015/10/21/chartex" xmlns:cx3="http://schemas.microsoft.com/office/drawing/2016/5/9/chartex" xmlns:cx4="http://schemas.microsoft.com/office/drawing/2016/5/10/chartex" xmlns:cx5="http://schemas.microsoft.com/office/drawing/2016/5/11/chartex" xmlns:cx6="http://schemas.microsoft.com/office/drawing/2016/5/12/chartex" xmlns:cx7="http://schemas.microsoft.com/office/drawing/2016/5/13/chartex" xmlns:cx8="http://schemas.microsoft.com/office/drawing/2016/5/14/chartex" xmlns:mc="http://schemas.openxmlformats.org/markup-compatibility/2006" xmlns:aink="http://schemas.microsoft.com/office/drawing/2016/ink" xmlns:am3d="http://schemas.microsoft.com/office/drawing/2017/model3d" xmlns:o="urn:schemas-microsoft-com:office:office" xmlns:oel="http://schemas.microsoft.com/office/2019/extlst" xmlns:r="http://schemas.openxmlformats.org/officeDocument/2006/relationships" xmlns:m="http://schemas.openxmlformats.org/officeDocument/2006/math" xmlns:v="urn:schemas-microsoft-com:vml" xmlns:wp14="http://schemas.microsoft.com/office/word/2010/wordprocessingDrawing" xmlns:wp="http://schemas.openxmlformats.org/drawingml/2006/wordprocessingDrawing" xmlns:w10="urn:schemas-microsoft-com:office:word" xmlns:w="http://schemas.openxmlformats.org/wordprocessingml/2006/main" xmlns:w14="http://schemas.microsoft.com/office/word/2010/wordml" xmlns:w15="http://schemas.microsoft.com/office/word/2012/wordml" xmlns:w16cex="http://schemas.microsoft.com/office/word/2018/wordml/cex" xmlns:w16cid="http://schemas.microsoft.com/office/word/2016/wordml/cid" xmlns:w16="http://schemas.microsoft.com/office/word/2018/wordml" xmlns:w16du="http://schemas.microsoft.com/office/word/2023/wordml/word16du" xmlns:w16sdtdh="http://schemas.microsoft.com/office/word/2020/wordml/sdtdatahash" xmlns:w16sdtfl="http://schemas.microsoft.com/office/word/2024/wordml/sdtformatlock" xmlns:w16se="http://schemas.microsoft.com/office/word/2015/wordml/symex" xmlns:wpg="http://schemas.microsoft.com/office/word/2010/wordprocessingGroup" xmlns:wpi="http://schemas.microsoft.com/office/word/2010/wordprocessingInk" xmlns:wne="http://schemas.microsoft.com/office/word/2006/wordml" xmlns:wps="http://schemas.microsoft.com/office/word/2010/wordprocessingShape" mc:Ignorable="w14 w15 w16se w16cid w16 w16cex w16sdtdh w16sdtfl w16du wp14">
   <w:p>
     <w:pPr>
@@ -1366,6 +1485,16 @@
 </w:ftr>
 </file>
 
+<file path=word/footer3.xml><?xml version="1.0" encoding="utf-8"?>
+<w:ftr xmlns:wpc="http://schemas.microsoft.com/office/word/2010/wordprocessingCanvas" xmlns:cx="http://schemas.microsoft.com/office/drawing/2014/chartex" xmlns:cx1="http://schemas.microsoft.com/office/drawing/2015/9/8/chartex" xmlns:cx2="http://schemas.microsoft.com/office/drawing/2015/10/21/chartex" xmlns:cx3="http://schemas.microsoft.com/office/drawing/2016/5/9/chartex" xmlns:cx4="http://schemas.microsoft.com/office/drawing/2016/5/10/chartex" xmlns:cx5="http://schemas.microsoft.com/office/drawing/2016/5/11/chartex" xmlns:cx6="http://schemas.microsoft.com/office/drawing/2016/5/12/chartex" xmlns:cx7="http://schemas.microsoft.com/office/drawing/2016/5/13/chartex" xmlns:cx8="http://schemas.microsoft.com/office/drawing/2016/5/14/chartex" xmlns:mc="http://schemas.openxmlformats.org/markup-compatibility/2006" xmlns:aink="http://schemas.microsoft.com/office/drawing/2016/ink" xmlns:am3d="http://schemas.microsoft.com/office/drawing/2017/model3d" xmlns:o="urn:schemas-microsoft-com:office:office" xmlns:oel="http://schemas.microsoft.com/office/2019/extlst" xmlns:r="http://schemas.openxmlformats.org/officeDocument/2006/relationships" xmlns:m="http://schemas.openxmlformats.org/officeDocument/2006/math" xmlns:v="urn:schemas-microsoft-com:vml" xmlns:wp14="http://schemas.microsoft.com/office/word/2010/wordprocessingDrawing" xmlns:wp="http://schemas.openxmlformats.org/drawingml/2006/wordprocessingDrawing" xmlns:w10="urn:schemas-microsoft-com:office:word" xmlns:w="http://schemas.openxmlformats.org/wordprocessingml/2006/main" xmlns:w14="http://schemas.microsoft.com/office/word/2010/wordml" xmlns:w15="http://schemas.microsoft.com/office/word/2012/wordml" xmlns:w16cex="http://schemas.microsoft.com/office/word/2018/wordml/cex" xmlns:w16cid="http://schemas.microsoft.com/office/word/2016/wordml/cid" xmlns:w16="http://schemas.microsoft.com/office/word/2018/wordml" xmlns:w16du="http://schemas.microsoft.com/office/word/2023/wordml/word16du" xmlns:w16sdtdh="http://schemas.microsoft.com/office/word/2020/wordml/sdtdatahash" xmlns:w16sdtfl="http://schemas.microsoft.com/office/word/2024/wordml/sdtformatlock" xmlns:w16se="http://schemas.microsoft.com/office/word/2015/wordml/symex" xmlns:wpg="http://schemas.microsoft.com/office/word/2010/wordprocessingGroup" xmlns:wpi="http://schemas.microsoft.com/office/word/2010/wordprocessingInk" xmlns:wne="http://schemas.microsoft.com/office/word/2006/wordml" xmlns:wps="http://schemas.microsoft.com/office/word/2010/wordprocessingShape" mc:Ignorable="w14 w15 w16se w16cid w16 w16cex w16sdtdh w16sdtfl w16du wp14">
+  <w:p>
+    <w:pPr>
+      <w:pStyle w:val="Footer"/>
+    </w:pPr>
+  </w:p>
+</w:ftr>
+</file>
+
 <file path=word/footnotes.xml><?xml version="1.0" encoding="utf-8"?>
 <w:footnotes xmlns:wpc="http://schemas.microsoft.com/office/word/2010/wordprocessingCanvas" xmlns:cx="http://schemas.microsoft.com/office/drawing/2014/chartex" xmlns:cx1="http://schemas.microsoft.com/office/drawing/2015/9/8/chartex" xmlns:cx2="http://schemas.microsoft.com/office/drawing/2015/10/21/chartex" xmlns:cx3="http://schemas.microsoft.com/office/drawing/2016/5/9/chartex" xmlns:cx4="http://schemas.microsoft.com/office/drawing/2016/5/10/chartex" xmlns:cx5="http://schemas.microsoft.com/office/drawing/2016/5/11/chartex" xmlns:cx6="http://schemas.microsoft.com/office/drawing/2016/5/12/chartex" xmlns:cx7="http://schemas.microsoft.com/office/drawing/2016/5/13/chartex" xmlns:cx8="http://schemas.microsoft.com/office/drawing/2016/5/14/chartex" xmlns:mc="http://schemas.openxmlformats.org/markup-compatibility/2006" xmlns:aink="http://schemas.microsoft.com/office/drawing/2016/ink" xmlns:am3d="http://schemas.microsoft.com/office/drawing/2017/model3d" xmlns:o="urn:schemas-microsoft-com:office:office" xmlns:oel="http://schemas.microsoft.com/office/2019/extlst" xmlns:r="http://schemas.openxmlformats.org/officeDocument/2006/relationships" xmlns:m="http://schemas.openxmlformats.org/officeDocument/2006/math" xmlns:v="urn:schemas-microsoft-com:vml" xmlns:wp14="http://schemas.microsoft.com/office/word/2010/wordprocessingDrawing" xmlns:wp="http://schemas.openxmlformats.org/drawingml/2006/wordprocessingDrawing" xmlns:w10="urn:schemas-microsoft-com:office:word" xmlns:w="http://schemas.openxmlformats.org/wordprocessingml/2006/main" xmlns:w14="http://schemas.microsoft.com/office/word/2010/wordml" xmlns:w15="http://schemas.microsoft.com/office/word/2012/wordml" xmlns:w16cex="http://schemas.microsoft.com/office/word/2018/wordml/cex" xmlns:w16cid="http://schemas.microsoft.com/office/word/2016/wordml/cid" xmlns:w16="http://schemas.microsoft.com/office/word/2018/wordml" xmlns:w16du="http://schemas.microsoft.com/office/word/2023/wordml/word16du" xmlns:w16sdtdh="http://schemas.microsoft.com/office/word/2020/wordml/sdtdatahash" xmlns:w16sdtfl="http://schemas.microsoft.com/office/word/2024/wordml/sdtformatlock" xmlns:w16se="http://schemas.microsoft.com/office/word/2015/wordml/symex" xmlns:wpg="http://schemas.microsoft.com/office/word/2010/wordprocessingGroup" xmlns:wpi="http://schemas.microsoft.com/office/word/2010/wordprocessingInk" xmlns:wne="http://schemas.microsoft.com/office/word/2006/wordml" xmlns:wps="http://schemas.microsoft.com/office/word/2010/wordprocessingShape" mc:Ignorable="w14 w15 w16se w16cid w16 w16cex w16sdtdh w16sdtfl w16du wp14">
   <w:footnote w:type="separator" w:id="-1">
@@ -1383,6 +1512,36 @@
     </w:p>
   </w:footnote>
 </w:footnotes>
+</file>
+
+<file path=word/header1.xml><?xml version="1.0" encoding="utf-8"?>
+<w:hdr xmlns:wpc="http://schemas.microsoft.com/office/word/2010/wordprocessingCanvas" xmlns:cx="http://schemas.microsoft.com/office/drawing/2014/chartex" xmlns:cx1="http://schemas.microsoft.com/office/drawing/2015/9/8/chartex" xmlns:cx2="http://schemas.microsoft.com/office/drawing/2015/10/21/chartex" xmlns:cx3="http://schemas.microsoft.com/office/drawing/2016/5/9/chartex" xmlns:cx4="http://schemas.microsoft.com/office/drawing/2016/5/10/chartex" xmlns:cx5="http://schemas.microsoft.com/office/drawing/2016/5/11/chartex" xmlns:cx6="http://schemas.microsoft.com/office/drawing/2016/5/12/chartex" xmlns:cx7="http://schemas.microsoft.com/office/drawing/2016/5/13/chartex" xmlns:cx8="http://schemas.microsoft.com/office/drawing/2016/5/14/chartex" xmlns:mc="http://schemas.openxmlformats.org/markup-compatibility/2006" xmlns:aink="http://schemas.microsoft.com/office/drawing/2016/ink" xmlns:am3d="http://schemas.microsoft.com/office/drawing/2017/model3d" xmlns:o="urn:schemas-microsoft-com:office:office" xmlns:oel="http://schemas.microsoft.com/office/2019/extlst" xmlns:r="http://schemas.openxmlformats.org/officeDocument/2006/relationships" xmlns:m="http://schemas.openxmlformats.org/officeDocument/2006/math" xmlns:v="urn:schemas-microsoft-com:vml" xmlns:wp14="http://schemas.microsoft.com/office/word/2010/wordprocessingDrawing" xmlns:wp="http://schemas.openxmlformats.org/drawingml/2006/wordprocessingDrawing" xmlns:w10="urn:schemas-microsoft-com:office:word" xmlns:w="http://schemas.openxmlformats.org/wordprocessingml/2006/main" xmlns:w14="http://schemas.microsoft.com/office/word/2010/wordml" xmlns:w15="http://schemas.microsoft.com/office/word/2012/wordml" xmlns:w16cex="http://schemas.microsoft.com/office/word/2018/wordml/cex" xmlns:w16cid="http://schemas.microsoft.com/office/word/2016/wordml/cid" xmlns:w16="http://schemas.microsoft.com/office/word/2018/wordml" xmlns:w16du="http://schemas.microsoft.com/office/word/2023/wordml/word16du" xmlns:w16sdtdh="http://schemas.microsoft.com/office/word/2020/wordml/sdtdatahash" xmlns:w16sdtfl="http://schemas.microsoft.com/office/word/2024/wordml/sdtformatlock" xmlns:w16se="http://schemas.microsoft.com/office/word/2015/wordml/symex" xmlns:wpg="http://schemas.microsoft.com/office/word/2010/wordprocessingGroup" xmlns:wpi="http://schemas.microsoft.com/office/word/2010/wordprocessingInk" xmlns:wne="http://schemas.microsoft.com/office/word/2006/wordml" xmlns:wps="http://schemas.microsoft.com/office/word/2010/wordprocessingShape" mc:Ignorable="w14 w15 w16se w16cid w16 w16cex w16sdtdh w16sdtfl w16du wp14">
+  <w:p>
+    <w:pPr>
+      <w:pStyle w:val="Header"/>
+    </w:pPr>
+  </w:p>
+</w:hdr>
+</file>
+
+<file path=word/header2.xml><?xml version="1.0" encoding="utf-8"?>
+<w:hdr xmlns:wpc="http://schemas.microsoft.com/office/word/2010/wordprocessingCanvas" xmlns:cx="http://schemas.microsoft.com/office/drawing/2014/chartex" xmlns:cx1="http://schemas.microsoft.com/office/drawing/2015/9/8/chartex" xmlns:cx2="http://schemas.microsoft.com/office/drawing/2015/10/21/chartex" xmlns:cx3="http://schemas.microsoft.com/office/drawing/2016/5/9/chartex" xmlns:cx4="http://schemas.microsoft.com/office/drawing/2016/5/10/chartex" xmlns:cx5="http://schemas.microsoft.com/office/drawing/2016/5/11/chartex" xmlns:cx6="http://schemas.microsoft.com/office/drawing/2016/5/12/chartex" xmlns:cx7="http://schemas.microsoft.com/office/drawing/2016/5/13/chartex" xmlns:cx8="http://schemas.microsoft.com/office/drawing/2016/5/14/chartex" xmlns:mc="http://schemas.openxmlformats.org/markup-compatibility/2006" xmlns:aink="http://schemas.microsoft.com/office/drawing/2016/ink" xmlns:am3d="http://schemas.microsoft.com/office/drawing/2017/model3d" xmlns:o="urn:schemas-microsoft-com:office:office" xmlns:oel="http://schemas.microsoft.com/office/2019/extlst" xmlns:r="http://schemas.openxmlformats.org/officeDocument/2006/relationships" xmlns:m="http://schemas.openxmlformats.org/officeDocument/2006/math" xmlns:v="urn:schemas-microsoft-com:vml" xmlns:wp14="http://schemas.microsoft.com/office/word/2010/wordprocessingDrawing" xmlns:wp="http://schemas.openxmlformats.org/drawingml/2006/wordprocessingDrawing" xmlns:w10="urn:schemas-microsoft-com:office:word" xmlns:w="http://schemas.openxmlformats.org/wordprocessingml/2006/main" xmlns:w14="http://schemas.microsoft.com/office/word/2010/wordml" xmlns:w15="http://schemas.microsoft.com/office/word/2012/wordml" xmlns:w16cex="http://schemas.microsoft.com/office/word/2018/wordml/cex" xmlns:w16cid="http://schemas.microsoft.com/office/word/2016/wordml/cid" xmlns:w16="http://schemas.microsoft.com/office/word/2018/wordml" xmlns:w16du="http://schemas.microsoft.com/office/word/2023/wordml/word16du" xmlns:w16sdtdh="http://schemas.microsoft.com/office/word/2020/wordml/sdtdatahash" xmlns:w16sdtfl="http://schemas.microsoft.com/office/word/2024/wordml/sdtformatlock" xmlns:w16se="http://schemas.microsoft.com/office/word/2015/wordml/symex" xmlns:wpg="http://schemas.microsoft.com/office/word/2010/wordprocessingGroup" xmlns:wpi="http://schemas.microsoft.com/office/word/2010/wordprocessingInk" xmlns:wne="http://schemas.microsoft.com/office/word/2006/wordml" xmlns:wps="http://schemas.microsoft.com/office/word/2010/wordprocessingShape" mc:Ignorable="w14 w15 w16se w16cid w16 w16cex w16sdtdh w16sdtfl w16du wp14">
+  <w:p>
+    <w:pPr>
+      <w:pStyle w:val="Header"/>
+    </w:pPr>
+  </w:p>
+</w:hdr>
+</file>
+
+<file path=word/header3.xml><?xml version="1.0" encoding="utf-8"?>
+<w:hdr xmlns:wpc="http://schemas.microsoft.com/office/word/2010/wordprocessingCanvas" xmlns:cx="http://schemas.microsoft.com/office/drawing/2014/chartex" xmlns:cx1="http://schemas.microsoft.com/office/drawing/2015/9/8/chartex" xmlns:cx2="http://schemas.microsoft.com/office/drawing/2015/10/21/chartex" xmlns:cx3="http://schemas.microsoft.com/office/drawing/2016/5/9/chartex" xmlns:cx4="http://schemas.microsoft.com/office/drawing/2016/5/10/chartex" xmlns:cx5="http://schemas.microsoft.com/office/drawing/2016/5/11/chartex" xmlns:cx6="http://schemas.microsoft.com/office/drawing/2016/5/12/chartex" xmlns:cx7="http://schemas.microsoft.com/office/drawing/2016/5/13/chartex" xmlns:cx8="http://schemas.microsoft.com/office/drawing/2016/5/14/chartex" xmlns:mc="http://schemas.openxmlformats.org/markup-compatibility/2006" xmlns:aink="http://schemas.microsoft.com/office/drawing/2016/ink" xmlns:am3d="http://schemas.microsoft.com/office/drawing/2017/model3d" xmlns:o="urn:schemas-microsoft-com:office:office" xmlns:oel="http://schemas.microsoft.com/office/2019/extlst" xmlns:r="http://schemas.openxmlformats.org/officeDocument/2006/relationships" xmlns:m="http://schemas.openxmlformats.org/officeDocument/2006/math" xmlns:v="urn:schemas-microsoft-com:vml" xmlns:wp14="http://schemas.microsoft.com/office/word/2010/wordprocessingDrawing" xmlns:wp="http://schemas.openxmlformats.org/drawingml/2006/wordprocessingDrawing" xmlns:w10="urn:schemas-microsoft-com:office:word" xmlns:w="http://schemas.openxmlformats.org/wordprocessingml/2006/main" xmlns:w14="http://schemas.microsoft.com/office/word/2010/wordml" xmlns:w15="http://schemas.microsoft.com/office/word/2012/wordml" xmlns:w16cex="http://schemas.microsoft.com/office/word/2018/wordml/cex" xmlns:w16cid="http://schemas.microsoft.com/office/word/2016/wordml/cid" xmlns:w16="http://schemas.microsoft.com/office/word/2018/wordml" xmlns:w16du="http://schemas.microsoft.com/office/word/2023/wordml/word16du" xmlns:w16sdtdh="http://schemas.microsoft.com/office/word/2020/wordml/sdtdatahash" xmlns:w16sdtfl="http://schemas.microsoft.com/office/word/2024/wordml/sdtformatlock" xmlns:w16se="http://schemas.microsoft.com/office/word/2015/wordml/symex" xmlns:wpg="http://schemas.microsoft.com/office/word/2010/wordprocessingGroup" xmlns:wpi="http://schemas.microsoft.com/office/word/2010/wordprocessingInk" xmlns:wne="http://schemas.microsoft.com/office/word/2006/wordml" xmlns:wps="http://schemas.microsoft.com/office/word/2010/wordprocessingShape" mc:Ignorable="w14 w15 w16se w16cid w16 w16cex w16sdtdh w16sdtfl w16du wp14">
+  <w:p>
+    <w:pPr>
+      <w:pStyle w:val="Header"/>
+    </w:pPr>
+  </w:p>
+</w:hdr>
 </file>
 
 <file path=word/numbering.xml><?xml version="1.0" encoding="utf-8"?>
@@ -1939,6 +2098,7 @@
   </w:style>
   <w:style w:type="paragraph" w:styleId="Heading1">
     <w:name w:val="heading 1"/>
+    <w:link w:val="Heading1Char"/>
     <w:uiPriority w:val="9"/>
     <w:qFormat/>
     <w:pPr>
@@ -2026,10 +2186,80 @@
       <w:color w:val="1F4D78"/>
     </w:rPr>
   </w:style>
+  <w:style w:type="paragraph" w:styleId="Heading7">
+    <w:name w:val="heading 7"/>
+    <w:basedOn w:val="Normal"/>
+    <w:next w:val="Normal"/>
+    <w:link w:val="Heading7Char"/>
+    <w:uiPriority w:val="9"/>
+    <w:semiHidden/>
+    <w:unhideWhenUsed/>
+    <w:qFormat/>
+    <w:rsid w:val="00D31B76"/>
+    <w:pPr>
+      <w:keepNext/>
+      <w:keepLines/>
+      <w:spacing w:before="40"/>
+      <w:outlineLvl w:val="6"/>
+    </w:pPr>
+    <w:rPr>
+      <w:rFonts w:asciiTheme="majorHAnsi" w:eastAsiaTheme="majorEastAsia" w:hAnsiTheme="majorHAnsi" w:cstheme="majorBidi"/>
+      <w:i/>
+      <w:iCs/>
+      <w:color w:val="0A2F40" w:themeColor="accent1" w:themeShade="7F"/>
+    </w:rPr>
+  </w:style>
+  <w:style w:type="paragraph" w:styleId="Heading8">
+    <w:name w:val="heading 8"/>
+    <w:basedOn w:val="Normal"/>
+    <w:next w:val="Normal"/>
+    <w:link w:val="Heading8Char"/>
+    <w:uiPriority w:val="9"/>
+    <w:semiHidden/>
+    <w:unhideWhenUsed/>
+    <w:qFormat/>
+    <w:rsid w:val="00D31B76"/>
+    <w:pPr>
+      <w:keepNext/>
+      <w:keepLines/>
+      <w:spacing w:before="40"/>
+      <w:outlineLvl w:val="7"/>
+    </w:pPr>
+    <w:rPr>
+      <w:rFonts w:asciiTheme="majorHAnsi" w:eastAsiaTheme="majorEastAsia" w:hAnsiTheme="majorHAnsi" w:cstheme="majorBidi"/>
+      <w:color w:val="272727" w:themeColor="text1" w:themeTint="D8"/>
+      <w:sz w:val="21"/>
+      <w:szCs w:val="21"/>
+    </w:rPr>
+  </w:style>
+  <w:style w:type="paragraph" w:styleId="Heading9">
+    <w:name w:val="heading 9"/>
+    <w:basedOn w:val="Normal"/>
+    <w:next w:val="Normal"/>
+    <w:link w:val="Heading9Char"/>
+    <w:uiPriority w:val="9"/>
+    <w:semiHidden/>
+    <w:unhideWhenUsed/>
+    <w:qFormat/>
+    <w:rsid w:val="00D31B76"/>
+    <w:pPr>
+      <w:keepNext/>
+      <w:keepLines/>
+      <w:spacing w:before="40"/>
+      <w:outlineLvl w:val="8"/>
+    </w:pPr>
+    <w:rPr>
+      <w:rFonts w:asciiTheme="majorHAnsi" w:eastAsiaTheme="majorEastAsia" w:hAnsiTheme="majorHAnsi" w:cstheme="majorBidi"/>
+      <w:i/>
+      <w:iCs/>
+      <w:color w:val="272727" w:themeColor="text1" w:themeTint="D8"/>
+      <w:sz w:val="21"/>
+      <w:szCs w:val="21"/>
+    </w:rPr>
+  </w:style>
   <w:style w:type="character" w:default="1" w:styleId="DefaultParagraphFont">
     <w:name w:val="Default Paragraph Font"/>
     <w:uiPriority w:val="1"/>
-    <w:semiHidden/>
     <w:unhideWhenUsed/>
   </w:style>
   <w:style w:type="table" w:default="1" w:styleId="TableNormal">
@@ -2112,6 +2342,339 @@
     <w:rPr>
       <w:sz w:val="20"/>
       <w:szCs w:val="20"/>
+    </w:rPr>
+  </w:style>
+  <w:style w:type="paragraph" w:styleId="Header">
+    <w:name w:val="header"/>
+    <w:basedOn w:val="Normal"/>
+    <w:link w:val="HeaderChar"/>
+    <w:uiPriority w:val="99"/>
+    <w:unhideWhenUsed/>
+    <w:rsid w:val="00D97315"/>
+    <w:pPr>
+      <w:tabs>
+        <w:tab w:val="center" w:pos="4680"/>
+        <w:tab w:val="right" w:pos="9360"/>
+      </w:tabs>
+    </w:pPr>
+  </w:style>
+  <w:style w:type="character" w:customStyle="1" w:styleId="HeaderChar">
+    <w:name w:val="Header Char"/>
+    <w:basedOn w:val="DefaultParagraphFont"/>
+    <w:link w:val="Header"/>
+    <w:uiPriority w:val="99"/>
+    <w:rsid w:val="00D97315"/>
+  </w:style>
+  <w:style w:type="paragraph" w:styleId="Footer">
+    <w:name w:val="footer"/>
+    <w:basedOn w:val="Normal"/>
+    <w:link w:val="FooterChar"/>
+    <w:uiPriority w:val="99"/>
+    <w:unhideWhenUsed/>
+    <w:rsid w:val="00D97315"/>
+    <w:pPr>
+      <w:tabs>
+        <w:tab w:val="center" w:pos="4680"/>
+        <w:tab w:val="right" w:pos="9360"/>
+      </w:tabs>
+    </w:pPr>
+  </w:style>
+  <w:style w:type="character" w:customStyle="1" w:styleId="FooterChar">
+    <w:name w:val="Footer Char"/>
+    <w:basedOn w:val="DefaultParagraphFont"/>
+    <w:link w:val="Footer"/>
+    <w:uiPriority w:val="99"/>
+    <w:rsid w:val="00D97315"/>
+  </w:style>
+  <w:style w:type="character" w:styleId="BookTitle">
+    <w:name w:val="Book Title"/>
+    <w:basedOn w:val="DefaultParagraphFont"/>
+    <w:uiPriority w:val="33"/>
+    <w:qFormat/>
+    <w:rsid w:val="00D31B76"/>
+    <w:rPr>
+      <w:b/>
+      <w:bCs/>
+      <w:i/>
+      <w:iCs/>
+      <w:spacing w:val="5"/>
+    </w:rPr>
+  </w:style>
+  <w:style w:type="paragraph" w:styleId="Caption">
+    <w:name w:val="caption"/>
+    <w:basedOn w:val="Normal"/>
+    <w:next w:val="Normal"/>
+    <w:uiPriority w:val="35"/>
+    <w:semiHidden/>
+    <w:unhideWhenUsed/>
+    <w:qFormat/>
+    <w:rsid w:val="00D31B76"/>
+    <w:pPr>
+      <w:spacing w:after="200"/>
+    </w:pPr>
+    <w:rPr>
+      <w:i/>
+      <w:iCs/>
+      <w:color w:val="0E2841" w:themeColor="text2"/>
+      <w:sz w:val="18"/>
+      <w:szCs w:val="18"/>
+    </w:rPr>
+  </w:style>
+  <w:style w:type="character" w:styleId="Emphasis">
+    <w:name w:val="Emphasis"/>
+    <w:basedOn w:val="DefaultParagraphFont"/>
+    <w:uiPriority w:val="20"/>
+    <w:qFormat/>
+    <w:rsid w:val="00D31B76"/>
+    <w:rPr>
+      <w:i/>
+      <w:iCs/>
+    </w:rPr>
+  </w:style>
+  <w:style w:type="character" w:customStyle="1" w:styleId="Heading7Char">
+    <w:name w:val="Heading 7 Char"/>
+    <w:basedOn w:val="DefaultParagraphFont"/>
+    <w:link w:val="Heading7"/>
+    <w:uiPriority w:val="9"/>
+    <w:semiHidden/>
+    <w:rsid w:val="00D31B76"/>
+    <w:rPr>
+      <w:rFonts w:asciiTheme="majorHAnsi" w:eastAsiaTheme="majorEastAsia" w:hAnsiTheme="majorHAnsi" w:cstheme="majorBidi"/>
+      <w:i/>
+      <w:iCs/>
+      <w:color w:val="0A2F40" w:themeColor="accent1" w:themeShade="7F"/>
+    </w:rPr>
+  </w:style>
+  <w:style w:type="character" w:customStyle="1" w:styleId="Heading8Char">
+    <w:name w:val="Heading 8 Char"/>
+    <w:basedOn w:val="DefaultParagraphFont"/>
+    <w:link w:val="Heading8"/>
+    <w:uiPriority w:val="9"/>
+    <w:semiHidden/>
+    <w:rsid w:val="00D31B76"/>
+    <w:rPr>
+      <w:rFonts w:asciiTheme="majorHAnsi" w:eastAsiaTheme="majorEastAsia" w:hAnsiTheme="majorHAnsi" w:cstheme="majorBidi"/>
+      <w:color w:val="272727" w:themeColor="text1" w:themeTint="D8"/>
+      <w:sz w:val="21"/>
+      <w:szCs w:val="21"/>
+    </w:rPr>
+  </w:style>
+  <w:style w:type="character" w:customStyle="1" w:styleId="Heading9Char">
+    <w:name w:val="Heading 9 Char"/>
+    <w:basedOn w:val="DefaultParagraphFont"/>
+    <w:link w:val="Heading9"/>
+    <w:uiPriority w:val="9"/>
+    <w:semiHidden/>
+    <w:rsid w:val="00D31B76"/>
+    <w:rPr>
+      <w:rFonts w:asciiTheme="majorHAnsi" w:eastAsiaTheme="majorEastAsia" w:hAnsiTheme="majorHAnsi" w:cstheme="majorBidi"/>
+      <w:i/>
+      <w:iCs/>
+      <w:color w:val="272727" w:themeColor="text1" w:themeTint="D8"/>
+      <w:sz w:val="21"/>
+      <w:szCs w:val="21"/>
+    </w:rPr>
+  </w:style>
+  <w:style w:type="character" w:styleId="IntenseEmphasis">
+    <w:name w:val="Intense Emphasis"/>
+    <w:basedOn w:val="DefaultParagraphFont"/>
+    <w:uiPriority w:val="21"/>
+    <w:qFormat/>
+    <w:rsid w:val="00D31B76"/>
+    <w:rPr>
+      <w:i/>
+      <w:iCs/>
+      <w:color w:val="156082" w:themeColor="accent1"/>
+    </w:rPr>
+  </w:style>
+  <w:style w:type="paragraph" w:styleId="IntenseQuote">
+    <w:name w:val="Intense Quote"/>
+    <w:basedOn w:val="Normal"/>
+    <w:next w:val="Normal"/>
+    <w:link w:val="IntenseQuoteChar"/>
+    <w:uiPriority w:val="30"/>
+    <w:qFormat/>
+    <w:rsid w:val="00D31B76"/>
+    <w:pPr>
+      <w:pBdr>
+        <w:top w:val="single" w:sz="4" w:space="10" w:color="156082" w:themeColor="accent1"/>
+        <w:bottom w:val="single" w:sz="4" w:space="10" w:color="156082" w:themeColor="accent1"/>
+      </w:pBdr>
+      <w:spacing w:before="360" w:after="360"/>
+      <w:ind w:left="864" w:right="864"/>
+      <w:jc w:val="center"/>
+    </w:pPr>
+    <w:rPr>
+      <w:i/>
+      <w:iCs/>
+      <w:color w:val="156082" w:themeColor="accent1"/>
+    </w:rPr>
+  </w:style>
+  <w:style w:type="character" w:customStyle="1" w:styleId="IntenseQuoteChar">
+    <w:name w:val="Intense Quote Char"/>
+    <w:basedOn w:val="DefaultParagraphFont"/>
+    <w:link w:val="IntenseQuote"/>
+    <w:uiPriority w:val="30"/>
+    <w:rsid w:val="00D31B76"/>
+    <w:rPr>
+      <w:i/>
+      <w:iCs/>
+      <w:color w:val="156082" w:themeColor="accent1"/>
+    </w:rPr>
+  </w:style>
+  <w:style w:type="character" w:styleId="IntenseReference">
+    <w:name w:val="Intense Reference"/>
+    <w:basedOn w:val="DefaultParagraphFont"/>
+    <w:uiPriority w:val="32"/>
+    <w:qFormat/>
+    <w:rsid w:val="00D31B76"/>
+    <w:rPr>
+      <w:b/>
+      <w:bCs/>
+      <w:smallCaps/>
+      <w:color w:val="156082" w:themeColor="accent1"/>
+      <w:spacing w:val="5"/>
+    </w:rPr>
+  </w:style>
+  <w:style w:type="paragraph" w:styleId="NoSpacing">
+    <w:name w:val="No Spacing"/>
+    <w:uiPriority w:val="1"/>
+    <w:qFormat/>
+    <w:rsid w:val="00D31B76"/>
+  </w:style>
+  <w:style w:type="paragraph" w:styleId="Quote">
+    <w:name w:val="Quote"/>
+    <w:basedOn w:val="Normal"/>
+    <w:next w:val="Normal"/>
+    <w:link w:val="QuoteChar"/>
+    <w:uiPriority w:val="29"/>
+    <w:qFormat/>
+    <w:rsid w:val="00D31B76"/>
+    <w:pPr>
+      <w:spacing w:before="200" w:after="160"/>
+      <w:ind w:left="864" w:right="864"/>
+      <w:jc w:val="center"/>
+    </w:pPr>
+    <w:rPr>
+      <w:i/>
+      <w:iCs/>
+      <w:color w:val="404040" w:themeColor="text1" w:themeTint="BF"/>
+    </w:rPr>
+  </w:style>
+  <w:style w:type="character" w:customStyle="1" w:styleId="QuoteChar">
+    <w:name w:val="Quote Char"/>
+    <w:basedOn w:val="DefaultParagraphFont"/>
+    <w:link w:val="Quote"/>
+    <w:uiPriority w:val="29"/>
+    <w:rsid w:val="00D31B76"/>
+    <w:rPr>
+      <w:i/>
+      <w:iCs/>
+      <w:color w:val="404040" w:themeColor="text1" w:themeTint="BF"/>
+    </w:rPr>
+  </w:style>
+  <w:style w:type="character" w:styleId="Strong">
+    <w:name w:val="Strong"/>
+    <w:basedOn w:val="DefaultParagraphFont"/>
+    <w:uiPriority w:val="22"/>
+    <w:qFormat/>
+    <w:rsid w:val="00D31B76"/>
+    <w:rPr>
+      <w:b/>
+      <w:bCs/>
+    </w:rPr>
+  </w:style>
+  <w:style w:type="paragraph" w:styleId="Subtitle">
+    <w:name w:val="Subtitle"/>
+    <w:basedOn w:val="Normal"/>
+    <w:next w:val="Normal"/>
+    <w:link w:val="SubtitleChar"/>
+    <w:uiPriority w:val="11"/>
+    <w:qFormat/>
+    <w:rsid w:val="00D31B76"/>
+    <w:pPr>
+      <w:numPr>
+        <w:ilvl w:val="1"/>
+      </w:numPr>
+      <w:spacing w:after="160"/>
+    </w:pPr>
+    <w:rPr>
+      <w:rFonts w:asciiTheme="minorHAnsi" w:eastAsiaTheme="minorEastAsia" w:hAnsiTheme="minorHAnsi" w:cstheme="minorBidi"/>
+      <w:color w:val="5A5A5A" w:themeColor="text1" w:themeTint="A5"/>
+      <w:spacing w:val="15"/>
+    </w:rPr>
+  </w:style>
+  <w:style w:type="character" w:customStyle="1" w:styleId="SubtitleChar">
+    <w:name w:val="Subtitle Char"/>
+    <w:basedOn w:val="DefaultParagraphFont"/>
+    <w:link w:val="Subtitle"/>
+    <w:uiPriority w:val="11"/>
+    <w:rsid w:val="00D31B76"/>
+    <w:rPr>
+      <w:rFonts w:asciiTheme="minorHAnsi" w:eastAsiaTheme="minorEastAsia" w:hAnsiTheme="minorHAnsi" w:cstheme="minorBidi"/>
+      <w:color w:val="5A5A5A" w:themeColor="text1" w:themeTint="A5"/>
+      <w:spacing w:val="15"/>
+    </w:rPr>
+  </w:style>
+  <w:style w:type="character" w:styleId="SubtleEmphasis">
+    <w:name w:val="Subtle Emphasis"/>
+    <w:basedOn w:val="DefaultParagraphFont"/>
+    <w:uiPriority w:val="19"/>
+    <w:qFormat/>
+    <w:rsid w:val="00D31B76"/>
+    <w:rPr>
+      <w:i/>
+      <w:iCs/>
+      <w:color w:val="404040" w:themeColor="text1" w:themeTint="BF"/>
+    </w:rPr>
+  </w:style>
+  <w:style w:type="character" w:styleId="SubtleReference">
+    <w:name w:val="Subtle Reference"/>
+    <w:basedOn w:val="DefaultParagraphFont"/>
+    <w:uiPriority w:val="31"/>
+    <w:qFormat/>
+    <w:rsid w:val="00D31B76"/>
+    <w:rPr>
+      <w:smallCaps/>
+      <w:color w:val="5A5A5A" w:themeColor="text1" w:themeTint="A5"/>
+    </w:rPr>
+  </w:style>
+  <w:style w:type="paragraph" w:styleId="TOCHeading">
+    <w:name w:val="TOC Heading"/>
+    <w:basedOn w:val="Heading1"/>
+    <w:next w:val="Normal"/>
+    <w:uiPriority w:val="39"/>
+    <w:semiHidden/>
+    <w:unhideWhenUsed/>
+    <w:qFormat/>
+    <w:rsid w:val="00D31B76"/>
+    <w:pPr>
+      <w:keepNext/>
+      <w:keepLines/>
+      <w:spacing w:after="0"/>
+      <w:outlineLvl w:val="9"/>
+    </w:pPr>
+    <w:rPr>
+      <w:rFonts w:asciiTheme="majorHAnsi" w:eastAsiaTheme="majorEastAsia" w:hAnsiTheme="majorHAnsi" w:cstheme="majorBidi"/>
+      <w:b w:val="0"/>
+      <w:bCs w:val="0"/>
+      <w:color w:val="0F4761" w:themeColor="accent1" w:themeShade="BF"/>
+      <w:sz w:val="32"/>
+      <w:szCs w:val="32"/>
+    </w:rPr>
+  </w:style>
+  <w:style w:type="character" w:customStyle="1" w:styleId="Heading1Char">
+    <w:name w:val="Heading 1 Char"/>
+    <w:basedOn w:val="DefaultParagraphFont"/>
+    <w:link w:val="Heading1"/>
+    <w:uiPriority w:val="9"/>
+    <w:rsid w:val="00D31B76"/>
+    <w:rPr>
+      <w:b/>
+      <w:bCs/>
+      <w:color w:val="002677"/>
+      <w:sz w:val="30"/>
+      <w:szCs w:val="30"/>
     </w:rPr>
   </w:style>
 </w:styles>
@@ -2434,6 +2997,6 @@
 
 <file path=docMetadata/LabelInfo.xml><?xml version="1.0" encoding="utf-8"?>
 <clbl:labelList xmlns:clbl="http://schemas.microsoft.com/office/2020/mipLabelMetadata">
-  <clbl:label id="{f42aa342-8706-4288-bd11-ebb85995028c}" enabled="1" method="Standard" siteId="{72f988bf-86f1-41af-91ab-2d7cd011db47}" contentBits="0" removed="0"/>
+  <clbl:label id="{87867195-f2b8-4ac2-b0b6-6bb73cb33afc}" enabled="1" method="Privileged" siteId="{72f988bf-86f1-41af-91ab-2d7cd011db47}" removed="0"/>
 </clbl:labelList>
 </file>
</xml_diff>

<commit_message>
Update UHC Finance Demo files
Co-authored-by: Copilot <223556219+Copilot@users.noreply.github.com>
</commit_message>
<xml_diff>
--- a/UHC_AgentSCALE_Finance_Demo_Prompts.docx
+++ b/UHC_AgentSCALE_Finance_Demo_Prompts.docx
@@ -14,7 +14,17 @@
           <w:sz w:val="40"/>
           <w:szCs w:val="40"/>
         </w:rPr>
-        <w:t>UnitedHealthcare — Finance Demo Prompt Library</w:t>
+        <w:t>Contoso Healthcare</w:t>
+      </w:r>
+      <w:r>
+        <w:rPr>
+          <w:b/>
+          <w:bCs/>
+          <w:color w:val="002677"/>
+          <w:sz w:val="40"/>
+          <w:szCs w:val="40"/>
+        </w:rPr>
+        <w:t xml:space="preserve"> — Finance Demo Prompt Library</w:t>
       </w:r>
     </w:p>
     <w:p>
@@ -52,7 +62,21 @@
         <w:spacing w:after="120"/>
       </w:pPr>
       <w:r>
-        <w:t>Each demo below is grounded in two finance files so the audience sees agents working on realistic UnitedHealthcare data:</w:t>
+        <w:t xml:space="preserve">Each demo below is grounded in two finance </w:t>
+      </w:r>
+      <w:proofErr w:type="gramStart"/>
+      <w:r>
+        <w:t>files</w:t>
+      </w:r>
+      <w:proofErr w:type="gramEnd"/>
+      <w:r>
+        <w:t xml:space="preserve"> so the audience sees agents working on realistic </w:t>
+      </w:r>
+      <w:r>
+        <w:t>Contoso Healthcare</w:t>
+      </w:r>
+      <w:r>
+        <w:t xml:space="preserve"> data:</w:t>
       </w:r>
     </w:p>
     <w:p>
@@ -65,7 +89,10 @@
         <w:spacing w:after="40"/>
       </w:pPr>
       <w:r>
-        <w:t>UHC_Finance_Demo_Detailed.xlsx — 6 tabs: Dashboard, Financial Summary (Jan–May), Providers (180), Claims (520), Payments (430), Deadlines (260).</w:t>
+        <w:t>Contoso Healthcare</w:t>
+      </w:r>
+      <w:r>
+        <w:t>_Finance_Demo_Detailed.xlsx — 6 tabs: Dashboard, Financial Summary (Jan–May), Providers (180), Claims (520), Payments (430), Deadlines (260).</w:t>
       </w:r>
     </w:p>
     <w:p>
@@ -78,7 +105,10 @@
         <w:spacing w:after="40"/>
       </w:pPr>
       <w:r>
-        <w:t>UHC_Finance_Report_Demo.docx — narrative finance report: Overview, Key Observations, Business Impact.</w:t>
+        <w:t>Contoso Healthcare</w:t>
+      </w:r>
+      <w:r>
+        <w:t>_Finance_Report_Demo.docx — narrative finance report: Overview, Key Observations, Business Impact.</w:t>
       </w:r>
     </w:p>
     <w:p>
@@ -189,7 +219,39 @@
                 <w:sz w:val="20"/>
                 <w:szCs w:val="20"/>
               </w:rPr>
-              <w:t>Acting as a healthcare finance researcher, use UHC_Finance_Demo_Detailed.xlsx and UHC_Finance_Report_Demo.docx as my internal data. Our monthly Medical Loss Ratio (MLR) is running about 71–74% from January through May. Research current industry benchmarks for commercial health-plan MLR and the ACA 80/20 rule, then compare our numbers against them. Tell me whether our MLR trend signals a pricing, compliance, or cost-management concern, and give me three strategic recommendations with sources I can cite to leadership.</w:t>
+              <w:t xml:space="preserve">Acting as a healthcare finance researcher, use </w:t>
+            </w:r>
+            <w:r>
+              <w:rPr>
+                <w:rFonts w:ascii="Consolas" w:eastAsia="Consolas" w:hAnsi="Consolas" w:cs="Consolas"/>
+                <w:sz w:val="20"/>
+                <w:szCs w:val="20"/>
+              </w:rPr>
+              <w:t>Contoso Healthcare</w:t>
+            </w:r>
+            <w:r>
+              <w:rPr>
+                <w:rFonts w:ascii="Consolas" w:eastAsia="Consolas" w:hAnsi="Consolas" w:cs="Consolas"/>
+                <w:sz w:val="20"/>
+                <w:szCs w:val="20"/>
+              </w:rPr>
+              <w:t xml:space="preserve">_Finance_Demo_Detailed.xlsx and </w:t>
+            </w:r>
+            <w:r>
+              <w:rPr>
+                <w:rFonts w:ascii="Consolas" w:eastAsia="Consolas" w:hAnsi="Consolas" w:cs="Consolas"/>
+                <w:sz w:val="20"/>
+                <w:szCs w:val="20"/>
+              </w:rPr>
+              <w:t>Contoso Healthcare</w:t>
+            </w:r>
+            <w:r>
+              <w:rPr>
+                <w:rFonts w:ascii="Consolas" w:eastAsia="Consolas" w:hAnsi="Consolas" w:cs="Consolas"/>
+                <w:sz w:val="20"/>
+                <w:szCs w:val="20"/>
+              </w:rPr>
+              <w:t>_Finance_Report_Demo.docx as my internal data. Our monthly Medical Loss Ratio (MLR) is running about 71–74% from January through May. Research current industry benchmarks for commercial health-plan MLR and the ACA 80/20 rule, then compare our numbers against them. Tell me whether our MLR trend signals a pricing, compliance, or cost-management concern, and give me three strategic recommendations with sources I can cite to leadership.</w:t>
             </w:r>
           </w:p>
         </w:tc>
@@ -299,7 +361,32 @@
                 <w:sz w:val="20"/>
                 <w:szCs w:val="20"/>
               </w:rPr>
-              <w:t>Acting as a financial analyst, analyze UHC_Finance_Demo_Detailed.xlsx. Using the Claims, Payments, and Providers tabs: (1) calculate total dollars outstanding and break it down by claim status and by provider contract status (In Network vs Out of Network); (2) list the top 10 providers by outstanding balance and flag any on payment hold; (3) compute the average Days Outstanding for pending claims and show the distribution; (4) quantify how much of the overdue-payment exposure sits with out-of-network providers. Show your calculations and return a chart of outstanding dollars by provider specialty.</w:t>
+              <w:t xml:space="preserve">Acting as a financial analyst, analyze </w:t>
+            </w:r>
+            <w:r>
+              <w:rPr>
+                <w:rFonts w:ascii="Consolas" w:eastAsia="Consolas" w:hAnsi="Consolas" w:cs="Consolas"/>
+                <w:sz w:val="20"/>
+                <w:szCs w:val="20"/>
+              </w:rPr>
+              <w:t>Contoso Healthcare</w:t>
+            </w:r>
+            <w:r>
+              <w:rPr>
+                <w:rFonts w:ascii="Consolas" w:eastAsia="Consolas" w:hAnsi="Consolas" w:cs="Consolas"/>
+                <w:sz w:val="20"/>
+                <w:szCs w:val="20"/>
+              </w:rPr>
+              <w:t xml:space="preserve">_Finance_Demo_Detailed.xlsx. Using the Claims, Payments, and Providers tabs: (1) calculate total dollars outstanding and break it down by claim status and by provider contract status (In Network vs Out of Network); (2) list the top 10 providers by outstanding balance and flag any on payment hold; (3) compute the average Days Outstanding for pending claims and show the distribution; (4) quantify how much of the overdue-payment exposure sits with out-of-network </w:t>
+            </w:r>
+            <w:r>
+              <w:rPr>
+                <w:rFonts w:ascii="Consolas" w:eastAsia="Consolas" w:hAnsi="Consolas" w:cs="Consolas"/>
+                <w:sz w:val="20"/>
+                <w:szCs w:val="20"/>
+              </w:rPr>
+              <w:lastRenderedPageBreak/>
+              <w:t>providers. Show your calculations and return a chart of outstanding dollars by provider specialty.</w:t>
             </w:r>
           </w:p>
         </w:tc>
@@ -410,7 +497,23 @@
                 <w:sz w:val="20"/>
                 <w:szCs w:val="20"/>
               </w:rPr>
-              <w:t>Acting as a healthcare revenue-integrity analyst, analyze UHC_Finance_Demo_Detailed.xlsx with a focus on denied and at-risk claims. Using the Claims, Providers, Payments, and Deadlines tabs: (1) identify every denied claim, group them by Denial Reason, and total the billed and allowed dollars tied up in each reason; (2) calculate the recoverable amount (Allowed Amount minus Paid Amount) for denied and pending claims, and rank the denial reasons by recovery opportunity; (3) cross-reference those claims to the Providers tab to surface the providers holding the most denied or unpaid dollars, flagging any that are Out of Network or on a payment hold; (4) pull every Appeals item from the Deadlines tab, show which appeals are past due or due within 7 days by Priority and Owner, and tie each one to the claim and dollars at stake; (5) estimate the total dollars at risk if the past-due appeals slip. Show your calculations, name the file and tab behind each number, and return a chart of recoverable dollars by denial reason. Finish with a prioritized recovery action list that names the top providers and the owners who need to act this week.</w:t>
+              <w:t xml:space="preserve">Acting as a healthcare revenue-integrity analyst, analyze </w:t>
+            </w:r>
+            <w:r>
+              <w:rPr>
+                <w:rFonts w:ascii="Consolas" w:eastAsia="Consolas" w:hAnsi="Consolas" w:cs="Consolas"/>
+                <w:sz w:val="20"/>
+                <w:szCs w:val="20"/>
+              </w:rPr>
+              <w:t>Contoso Healthcare</w:t>
+            </w:r>
+            <w:r>
+              <w:rPr>
+                <w:rFonts w:ascii="Consolas" w:eastAsia="Consolas" w:hAnsi="Consolas" w:cs="Consolas"/>
+                <w:sz w:val="20"/>
+                <w:szCs w:val="20"/>
+              </w:rPr>
+              <w:t>_Finance_Demo_Detailed.xlsx with a focus on denied and at-risk claims. Using the Claims, Providers, Payments, and Deadlines tabs: (1) identify every denied claim, group them by Denial Reason, and total the billed and allowed dollars tied up in each reason; (2) calculate the recoverable amount (Allowed Amount minus Paid Amount) for denied and pending claims, and rank the denial reasons by recovery opportunity; (3) cross-reference those claims to the Providers tab to surface the providers holding the most denied or unpaid dollars, flagging any that are Out of Network or on a payment hold; (4) pull every Appeals item from the Deadlines tab, show which appeals are past due or due within 7 days by Priority and Owner, and tie each one to the claim and dollars at stake; (5) estimate the total dollars at risk if the past-due appeals slip. Show your calculations, name the file and tab behind each number, and return a chart of recoverable dollars by denial reason. Finish with a prioritized recovery action list that names the top providers and the owners who need to act this week.</w:t>
             </w:r>
           </w:p>
         </w:tc>
@@ -588,7 +691,32 @@
                 <w:sz w:val="20"/>
                 <w:szCs w:val="20"/>
               </w:rPr>
-              <w:t>Open UHC_Finance_Demo_Detailed.xlsx. From the Financial Summary, Claims, Payments, and Deadlines tabs, produce a structured findings summary I can reuse downstream. Include: the Jan–May trend for premium revenue, claims paid, and net income; total outstanding payments and how many are overdue or on hold; the number of claims pending more than 45 days; and a count of past-due deadlines by priority. Present it as a clean, labeled summary with the key numbers called out so I can hand it to a Word agent next.</w:t>
+              <w:t xml:space="preserve">Open </w:t>
+            </w:r>
+            <w:r>
+              <w:rPr>
+                <w:rFonts w:ascii="Consolas" w:eastAsia="Consolas" w:hAnsi="Consolas" w:cs="Consolas"/>
+                <w:sz w:val="20"/>
+                <w:szCs w:val="20"/>
+              </w:rPr>
+              <w:t>Contoso Healthcare</w:t>
+            </w:r>
+            <w:r>
+              <w:rPr>
+                <w:rFonts w:ascii="Consolas" w:eastAsia="Consolas" w:hAnsi="Consolas" w:cs="Consolas"/>
+                <w:sz w:val="20"/>
+                <w:szCs w:val="20"/>
+              </w:rPr>
+              <w:t xml:space="preserve">_Finance_Demo_Detailed.xlsx. From the Financial Summary, Claims, Payments, and Deadlines tabs, produce a structured findings summary I can reuse downstream. Include: the Jan–May trend for premium revenue, claims paid, </w:t>
+            </w:r>
+            <w:r>
+              <w:rPr>
+                <w:rFonts w:ascii="Consolas" w:eastAsia="Consolas" w:hAnsi="Consolas" w:cs="Consolas"/>
+                <w:sz w:val="20"/>
+                <w:szCs w:val="20"/>
+              </w:rPr>
+              <w:lastRenderedPageBreak/>
+              <w:t>and net income; total outstanding payments and how many are overdue or on hold; the number of claims pending more than 45 days; and a count of past-due deadlines by priority. Present it as a clean, labeled summary with the key numbers called out so I can hand it to a Word agent next.</w:t>
             </w:r>
           </w:p>
         </w:tc>
@@ -687,7 +815,39 @@
                 <w:sz w:val="20"/>
                 <w:szCs w:val="20"/>
               </w:rPr>
-              <w:t>Using the findings from the Excel analysis above, draft a one-page UnitedHealthcare Finance Operations Brief here in the chat. Structure it as: Executive Summary, Financial Performance (the Jan–May trend), Operational Risks (overdue payments, aged claims, and past-due deadlines), and Recommended Actions. Match the tone of UHC_Finance_Report_Demo.docx. Write the full brief in the chat so I can review and edit it before we turn it into slides.</w:t>
+              <w:t xml:space="preserve">Using the findings from the Excel analysis above, draft a one-page </w:t>
+            </w:r>
+            <w:r>
+              <w:rPr>
+                <w:rFonts w:ascii="Consolas" w:eastAsia="Consolas" w:hAnsi="Consolas" w:cs="Consolas"/>
+                <w:sz w:val="20"/>
+                <w:szCs w:val="20"/>
+              </w:rPr>
+              <w:t>Contoso Healthcare</w:t>
+            </w:r>
+            <w:r>
+              <w:rPr>
+                <w:rFonts w:ascii="Consolas" w:eastAsia="Consolas" w:hAnsi="Consolas" w:cs="Consolas"/>
+                <w:sz w:val="20"/>
+                <w:szCs w:val="20"/>
+              </w:rPr>
+              <w:t xml:space="preserve"> Finance Operations Brief here in the chat. Structure it as: Executive Summary, Financial Performance (the Jan–May trend), Operational Risks (overdue payments, aged claims, and past-due deadlines), and Recommended Actions. Match the tone of </w:t>
+            </w:r>
+            <w:r>
+              <w:rPr>
+                <w:rFonts w:ascii="Consolas" w:eastAsia="Consolas" w:hAnsi="Consolas" w:cs="Consolas"/>
+                <w:sz w:val="20"/>
+                <w:szCs w:val="20"/>
+              </w:rPr>
+              <w:t>Contoso Healthcare</w:t>
+            </w:r>
+            <w:r>
+              <w:rPr>
+                <w:rFonts w:ascii="Consolas" w:eastAsia="Consolas" w:hAnsi="Consolas" w:cs="Consolas"/>
+                <w:sz w:val="20"/>
+                <w:szCs w:val="20"/>
+              </w:rPr>
+              <w:t>_Finance_Report_Demo.docx. Write the full brief in the chat so I can review and edit it before we turn it into slides.</w:t>
             </w:r>
           </w:p>
         </w:tc>
@@ -785,7 +945,23 @@
                 <w:sz w:val="20"/>
                 <w:szCs w:val="20"/>
               </w:rPr>
-              <w:t>Take the finance brief above and turn it into a 6-slide executive presentation: (1) Title — UHC Finance Operations Review; (2) Financial Performance, with the Jan–May revenue and net-income figures and a trend chart; (3) Claims &amp; Payment Health; (4) Top Operational Risks; (5) Recommended Actions; (6) Next Steps &amp; Owners. Use a clean corporate finance style and pull the numbers straight from the brief.</w:t>
+              <w:t xml:space="preserve">Take the finance brief above and turn it into a 6-slide executive presentation: (1) Title — </w:t>
+            </w:r>
+            <w:r>
+              <w:rPr>
+                <w:rFonts w:ascii="Consolas" w:eastAsia="Consolas" w:hAnsi="Consolas" w:cs="Consolas"/>
+                <w:sz w:val="20"/>
+                <w:szCs w:val="20"/>
+              </w:rPr>
+              <w:t>Contoso Healthcare</w:t>
+            </w:r>
+            <w:r>
+              <w:rPr>
+                <w:rFonts w:ascii="Consolas" w:eastAsia="Consolas" w:hAnsi="Consolas" w:cs="Consolas"/>
+                <w:sz w:val="20"/>
+                <w:szCs w:val="20"/>
+              </w:rPr>
+              <w:t xml:space="preserve"> Finance Operations Review; (2) Financial Performance, with the Jan–May revenue and net-income figures and a trend chart; (3) Claims &amp; Payment Health; (4) Top Operational Risks; (5) Recommended Actions; (6) Next Steps &amp; Owners. Use a clean corporate finance style and pull the numbers straight from the brief.</w:t>
             </w:r>
           </w:p>
         </w:tc>
@@ -896,7 +1072,23 @@
                 <w:sz w:val="20"/>
                 <w:szCs w:val="20"/>
               </w:rPr>
-              <w:t>Create an agent named “UHC Finance Ops Assistant.”</w:t>
+              <w:t>Create an agent named “</w:t>
+            </w:r>
+            <w:r>
+              <w:rPr>
+                <w:rFonts w:ascii="Consolas" w:eastAsia="Consolas" w:hAnsi="Consolas" w:cs="Consolas"/>
+                <w:sz w:val="20"/>
+                <w:szCs w:val="20"/>
+              </w:rPr>
+              <w:t>Contoso Healthcare</w:t>
+            </w:r>
+            <w:r>
+              <w:rPr>
+                <w:rFonts w:ascii="Consolas" w:eastAsia="Consolas" w:hAnsi="Consolas" w:cs="Consolas"/>
+                <w:sz w:val="20"/>
+                <w:szCs w:val="20"/>
+              </w:rPr>
+              <w:t xml:space="preserve"> Finance Ops Assistant.”</w:t>
             </w:r>
           </w:p>
           <w:p>
@@ -914,7 +1106,23 @@
                 <w:sz w:val="20"/>
                 <w:szCs w:val="20"/>
               </w:rPr>
-              <w:t>Purpose: Answer finance and operations questions using UHC_Finance_Demo_Detailed.xlsx</w:t>
+              <w:t xml:space="preserve">Purpose: Answer finance and operations questions using </w:t>
+            </w:r>
+            <w:r>
+              <w:rPr>
+                <w:rFonts w:ascii="Consolas" w:eastAsia="Consolas" w:hAnsi="Consolas" w:cs="Consolas"/>
+                <w:sz w:val="20"/>
+                <w:szCs w:val="20"/>
+              </w:rPr>
+              <w:t>Contoso Healthcare</w:t>
+            </w:r>
+            <w:r>
+              <w:rPr>
+                <w:rFonts w:ascii="Consolas" w:eastAsia="Consolas" w:hAnsi="Consolas" w:cs="Consolas"/>
+                <w:sz w:val="20"/>
+                <w:szCs w:val="20"/>
+              </w:rPr>
+              <w:t>_Finance_Demo_Detailed.xlsx</w:t>
             </w:r>
           </w:p>
           <w:p>
@@ -927,7 +1135,23 @@
                 <w:sz w:val="20"/>
                 <w:szCs w:val="20"/>
               </w:rPr>
-              <w:t>and UHC_Finance_Report_Demo.docx as its knowledge sources.</w:t>
+              <w:t xml:space="preserve">and </w:t>
+            </w:r>
+            <w:r>
+              <w:rPr>
+                <w:rFonts w:ascii="Consolas" w:eastAsia="Consolas" w:hAnsi="Consolas" w:cs="Consolas"/>
+                <w:sz w:val="20"/>
+                <w:szCs w:val="20"/>
+              </w:rPr>
+              <w:t>Contoso Healthcare</w:t>
+            </w:r>
+            <w:r>
+              <w:rPr>
+                <w:rFonts w:ascii="Consolas" w:eastAsia="Consolas" w:hAnsi="Consolas" w:cs="Consolas"/>
+                <w:sz w:val="20"/>
+                <w:szCs w:val="20"/>
+              </w:rPr>
+              <w:t>_Finance_Report_Demo.docx as its knowledge sources.</w:t>
             </w:r>
           </w:p>
           <w:p>
@@ -1258,7 +1482,43 @@
                 <w:szCs w:val="20"/>
               </w:rPr>
               <w:lastRenderedPageBreak/>
-              <w:t xml:space="preserve">Using the finance brief, slide outline, and analysis above, create a one-page executive infographic for UnitedHealthcare Finance Operations. The infographic should visually summarize: (1) Jan–May financial performance, including premium revenue, claims paid, net income, and MLR trend; (2) claims and payment health, including overdue payments, aged pending claims, and dollars at risk; (3) the top operational risks from denials, payment holds, and past-due deadlines; and (4) the three recommended actions for leadership. Use a clean corporate healthcare-finance style with concise labels, large headline numbers, simple icons, and a left-to-right flow from Performance → Risk → Action. Include only numbers supported by UHC_Finance_Demo_Detailed.xlsx or the brief </w:t>
+              <w:t xml:space="preserve">Using the finance brief, slide outline, and analysis above, create a one-page executive infographic for </w:t>
+            </w:r>
+            <w:r>
+              <w:rPr>
+                <w:rFonts w:ascii="Consolas" w:hAnsi="Consolas"/>
+                <w:color w:val="000000"/>
+                <w:sz w:val="20"/>
+                <w:szCs w:val="20"/>
+              </w:rPr>
+              <w:t>Contoso Healthcare</w:t>
+            </w:r>
+            <w:r>
+              <w:rPr>
+                <w:rFonts w:ascii="Consolas" w:hAnsi="Consolas"/>
+                <w:color w:val="000000"/>
+                <w:sz w:val="20"/>
+                <w:szCs w:val="20"/>
+              </w:rPr>
+              <w:t xml:space="preserve"> Finance Operations. The infographic should visually summarize: (1) Jan–May financial performance, including premium revenue, claims paid, net income, and MLR trend; (2) claims and payment health, including overdue payments, aged pending claims, and dollars at risk; (3) the top operational risks from denials, payment holds, and past-due deadlines; and (4) the three recommended actions for leadership. Use a clean corporate healthcare-finance style with concise labels, large headline numbers, simple icons, and a left-to-right flow from Performance → Risk → Action. Include only numbers supported by </w:t>
+            </w:r>
+            <w:r>
+              <w:rPr>
+                <w:rFonts w:ascii="Consolas" w:hAnsi="Consolas"/>
+                <w:color w:val="000000"/>
+                <w:sz w:val="20"/>
+                <w:szCs w:val="20"/>
+              </w:rPr>
+              <w:t>Contoso Healthcare</w:t>
+            </w:r>
+            <w:r>
+              <w:rPr>
+                <w:rFonts w:ascii="Consolas" w:hAnsi="Consolas"/>
+                <w:color w:val="000000"/>
+                <w:sz w:val="20"/>
+                <w:szCs w:val="20"/>
+              </w:rPr>
+              <w:t xml:space="preserve">_Finance_Demo_Detailed.xlsx or the brief </w:t>
             </w:r>
             <w:proofErr w:type="gramStart"/>
             <w:r>
@@ -1341,7 +1601,67 @@
           <w:sz w:val="18"/>
           <w:szCs w:val="18"/>
         </w:rPr>
-        <w:t>Prepared for the MS 4019 Agent SCALE delivery — United Healthcare (finance demos). All prompts reference UHC_Finance_Demo_Detailed.xlsx and UHC_Finance_Report_Demo.docx.</w:t>
+        <w:t xml:space="preserve">Prepared for the MS 4019 Agent SCALE delivery — </w:t>
+      </w:r>
+      <w:r>
+        <w:rPr>
+          <w:i/>
+          <w:iCs/>
+          <w:color w:val="666666"/>
+          <w:sz w:val="18"/>
+          <w:szCs w:val="18"/>
+        </w:rPr>
+        <w:t>Contoso Healthcare</w:t>
+      </w:r>
+      <w:r>
+        <w:rPr>
+          <w:i/>
+          <w:iCs/>
+          <w:color w:val="666666"/>
+          <w:sz w:val="18"/>
+          <w:szCs w:val="18"/>
+        </w:rPr>
+        <w:t xml:space="preserve"> (finance demos). All prompts reference </w:t>
+      </w:r>
+      <w:r>
+        <w:rPr>
+          <w:i/>
+          <w:iCs/>
+          <w:color w:val="666666"/>
+          <w:sz w:val="18"/>
+          <w:szCs w:val="18"/>
+        </w:rPr>
+        <w:t>Contoso Healthcare</w:t>
+      </w:r>
+      <w:r>
+        <w:rPr>
+          <w:i/>
+          <w:iCs/>
+          <w:color w:val="666666"/>
+          <w:sz w:val="18"/>
+          <w:szCs w:val="18"/>
+        </w:rPr>
+        <w:t xml:space="preserve">_Finance_Demo_Detailed.xlsx and </w:t>
+      </w:r>
+      <w:r>
+        <w:rPr>
+          <w:i/>
+          <w:iCs/>
+          <w:color w:val="666666"/>
+          <w:sz w:val="18"/>
+          <w:szCs w:val="18"/>
+        </w:rPr>
+        <w:t>Contoso Healthcare</w:t>
+      </w:r>
+      <w:r>
+        <w:rPr>
+          <w:i/>
+          <w:iCs/>
+          <w:color w:val="666666"/>
+          <w:sz w:val="18"/>
+          <w:szCs w:val="18"/>
+        </w:rPr>
+        <w:t>_Finance_Report_Demo.docx.</w:t>
       </w:r>
     </w:p>
     <w:p/>
@@ -1402,7 +1722,15 @@
         <w:sz w:val="16"/>
         <w:szCs w:val="16"/>
       </w:rPr>
-      <w:t xml:space="preserve">UHC Finance Demo Prompt </w:t>
+      <w:t>Contoso Healthcare</w:t>
+    </w:r>
+    <w:r>
+      <w:rPr>
+        <w:color w:val="888888"/>
+        <w:sz w:val="16"/>
+        <w:szCs w:val="16"/>
+      </w:rPr>
+      <w:t xml:space="preserve"> Finance Demo Prompt </w:t>
     </w:r>
     <w:proofErr w:type="gramStart"/>
     <w:r>
@@ -2260,6 +2588,7 @@
   <w:style w:type="character" w:default="1" w:styleId="DefaultParagraphFont">
     <w:name w:val="Default Paragraph Font"/>
     <w:uiPriority w:val="1"/>
+    <w:semiHidden/>
     <w:unhideWhenUsed/>
   </w:style>
   <w:style w:type="table" w:default="1" w:styleId="TableNormal">

</xml_diff>